<commit_message>
Some windows have stamps which includes the year it's manufactured. The 3 sashes on the dining room window, they are all manufactured in 2008. For the approved family window, one of the sashes (with matched hardware and looking) is manufactured in 2014
</commit_message>
<xml_diff>
--- a/Filings/Complaint_Lu_Hu_v_Fire_Insurance_Exchange.docx
+++ b/Filings/Complaint_Lu_Hu_v_Fire_Insurance_Exchange.docx
@@ -2034,14 +2034,26 @@
         <w:rPr>
           <w:highlight w:val="yellow"/>
         </w:rPr>
-        <w:t>and wrote note and draw pictures on this notebook</w:t>
-      </w:r>
-      <w:r>
-        <w:t xml:space="preserve"> — Defendant stated in writing on October 10, 2025 that “the file does not contain a report on the requested date,” while Mr. Brau stated on October 29, 2025 that “all the information we can release has already been sent to you”; (b) any report or estimate from the appraisal umpire — Defendant confirmed in writing on September 24, 2025 that none exists; and (c) the line-item identification of which windows or sashes were within the 2020 </w:t>
+        <w:t xml:space="preserve">and wrote note and draw pictures on </w:t>
+      </w:r>
+      <w:r>
+        <w:rPr>
+          <w:highlight w:val="yellow"/>
+        </w:rPr>
+        <w:t>his paper</w:t>
+      </w:r>
+      <w:r>
+        <w:rPr>
+          <w:highlight w:val="yellow"/>
+        </w:rPr>
+        <w:t xml:space="preserve"> notebook</w:t>
+      </w:r>
+      <w:r>
+        <w:t xml:space="preserve"> — Defendant stated in writing on October 10, 2025 that “the file does not contain a report on the requested date,” while Mr. Brau stated on October 29, 2025 that “all the information we can release has already been sent to you”; (b) any report or estimate from the appraisal umpire — Defendant confirmed in writing on September 24, 2025 that none exists; and (c) the line-item identification of which </w:t>
       </w:r>
       <w:r>
         <w:lastRenderedPageBreak/>
-        <w:t>claim’s scope, which Plaintiffs have repeatedly requested. Defendant is a regulated property insurer subject to the claim-file documentation requirements of Minn. Stat. § 72A.201, including Subdivision 3(3), which makes it an unfair claims practice to fail to include in the claim file all written communications and transactions emanating from or received by the insurer, as well as all notes and work papers relating to the claim, and knew or should have known, at all times after its September 3, 2024 denial, that its claim file would be material to reasonably foreseeable litigation. Plaintiffs reserve the right to seek discovery sanctions under Minn. R. Civ. P. 37 and an adverse-inference instruction at trial.</w:t>
+        <w:t>windows or sashes were within the 2020 claim’s scope, which Plaintiffs have repeatedly requested. Defendant is a regulated property insurer subject to the claim-file documentation requirements of Minn. Stat. § 72A.201, including Subdivision 3(3), which makes it an unfair claims practice to fail to include in the claim file all written communications and transactions emanating from or received by the insurer, as well as all notes and work papers relating to the claim, and knew or should have known, at all times after its September 3, 2024 denial, that its claim file would be material to reasonably foreseeable litigation. Plaintiffs reserve the right to seek discovery sanctions under Minn. R. Civ. P. 37 and an adverse-inference instruction at trial.</w:t>
       </w:r>
     </w:p>
     <w:p>
@@ -2348,12 +2360,27 @@
           <w:i/>
           <w:iCs/>
         </w:rPr>
-        <w:t xml:space="preserve"> reservation). The award identifies the awarded windows only by the undefined codes “F1.7” and “B1.2.” Defendant has acknowledged that the umpire produced no report or estimate, and Defendant has been unable to describe the award’s scope consistently across three written attempts. Nothing on the face of the award, and nothing in any record Defendant has produced, shows that the panel individually inspected and valued any window beyond the two it awarded. The Prieve Engineering report itself documents dents, marks, and indentations across at least nineteen distinct windows, plus a sliding door, on the home, including the upper-west three-unit bedroom window (photographs A-43 through A-46), the upper southwest bedroom window (photographs A-59 through A-65), the upper east window above the porch (photographs A-118 through A-124), the northeast-facing family room window (photographs A-125 through A-135), the southeast window at deck (photographs A-136 through A-141), the upper bay window group at the central quadrant (photographs A-147 through A-160), the upper east window above porch (photographs A-161 through A-166), the four-season porch windows (photographs A-167 through A-175), the north-facing porch window (photographs A-176 through A-183), the kitchen corner windows (photographs A-184 through A-195), the main-level east window at the </w:t>
+        <w:t xml:space="preserve"> reservation). The award identifies the awarded windows only by the undefined codes “F1.7” and “B1.2.” Defendant has acknowledged that the umpire produced no report or estimate, and Defendant has been unable to describe the award’s scope consistently across three written attempts. Nothing on the face of the award, and nothing in any record Defendant has produced, shows that the panel individually inspected and valued any window beyond the two it awarded. The Prieve Engineering report itself documents dents, marks, and indentations across at least nineteen distinct windows, plus a sliding door, on the home</w:t>
       </w:r>
       <w:r>
         <w:rPr>
           <w:i/>
           <w:iCs/>
+          <w:highlight w:val="yellow"/>
+        </w:rPr>
+        <w:t>, including the upper-west three-unit bedroom window (photographs A-43 through A-46), the upper southwest bedroom window (photographs A-59 through A-65), the upper east window above the porch (photographs A-118 through A-124), the northeast-facing family room window (photographs A-125 through A-135), the southeast window at deck (photographs A-136 through A-141), the upper bay window group at the central quadrant (photographs A-147 through A-160), the upper east window above porch (photographs A-161 through A-166), the four-season porch windows (photographs A-167 through A-175), the north-facing porch window (photographs A-176 through A-183), the kitchen corner windows (photographs A-184 through A-195), the main-level east window at the</w:t>
+      </w:r>
+      <w:r>
+        <w:rPr>
+          <w:i/>
+          <w:iCs/>
+        </w:rPr>
+        <w:t xml:space="preserve"> </w:t>
+      </w:r>
+      <w:r>
+        <w:rPr>
+          <w:i/>
+          <w:iCs/>
         </w:rPr>
         <w:lastRenderedPageBreak/>
         <w:t xml:space="preserve">north quadrant (photographs A-196 through A-204), the upper-north window above the kitchen (photographs A-205 and A-206), and the rear/east garage window (photographs A-213 through A-217). Under </w:t>
@@ -2457,7 +2484,16 @@
       </w:r>
       <w:proofErr w:type="spellEnd"/>
       <w:r>
-        <w:t>) dented downspouts at three elevations of the home — photographs A-42 (front), A-91 through A-93 (south side), and A-98 and A-99 (east side); (ii) dented flashing at the base of the wall along the deck — photographs A-103, A-128, and A-129; and (iii) a dent with scrape mark in the screen of a sliding-door window — photograph A-141. Plaintiffs’ gutters and downspouts were replaced after September 13, 2021, such that any dent on those components is direct physical evidence of post-2020 hail at the property. Coverage and amount of loss for each of these non-window components is a live coverage question for the Court under Count I, and Defendant cannot raise the binding effect of the appraisal award as a bar because the panel never had jurisdiction over them.</w:t>
+        <w:t xml:space="preserve">) dented downspouts at three elevations of the home — </w:t>
+      </w:r>
+      <w:r>
+        <w:rPr>
+          <w:highlight w:val="yellow"/>
+        </w:rPr>
+        <w:t>photographs A-42 (front), A-91 through A-93 (south side), and A-98 and A-99 (east side); (ii) dented flashing at the base of the wall along the deck — photographs A-103, A-128, and A-129; and (iii) a dent with scrape mark in the screen of a sliding-door window — photograph A-141.</w:t>
+      </w:r>
+      <w:r>
+        <w:t xml:space="preserve"> Plaintiffs’ gutters and downspouts were replaced after September 13, 2021, such that any dent on those components is direct physical evidence of post-2020 hail at the property. Coverage and amount of loss for each of these non-window components is a live coverage question for the Court under Count I, and Defendant cannot raise the binding effect of the appraisal award as a bar because the panel never had jurisdiction over them.</w:t>
       </w:r>
     </w:p>
     <w:p>

</xml_diff>